<commit_message>
Repair split p-value from greedy-regex insertion; mark CD8 coverage gap closed; add end-to-end project document
</commit_message>
<xml_diff>
--- a/manuscript.docx
+++ b/manuscript.docx
@@ -1436,7 +1436,7 @@
         <w:t xml:space="preserve"> </w:t>
       </w:r>
       <w:r>
-        <w:t xml:space="preserve">leukocyte fraction (T-cell score vs leukocyte %: Spearman ρ=0.67, p=3. Validation was measure-specific: the CD8 estimate tracked measured leukocyte percentage (ρ=0.47) but showed no correlation with measured lymphocyte-infiltration percentage (ρ=0.02, p=0.74;</w:t>
+        <w:t xml:space="preserve">leukocyte fraction (T-cell score vs leukocyte %: Spearman ρ=0.67, p=3.6×10⁻³⁶; ImmuneScore ρ=0.65; Figure 4A,B). Validation was measure-specific: the CD8 estimate tracked measured leukocyte percentage (ρ=0.47) but showed no correlation with measured lymphocyte-infiltration percentage (ρ=0.02, p=0.74;</w:t>
       </w:r>
       <w:r>
         <w:t xml:space="preserve"> </w:t>
@@ -1448,7 +1448,7 @@
         <w:t xml:space="preserve">results/immune/validation_vs_measured.csv</w:t>
       </w:r>
       <w:r>
-        <w:t xml:space="preserve">), so the deconvolution should be read as capturing overall immune burden rather than lymphocyte subset composition.6×10⁻³⁶; ImmuneScore ρ=0.65; Figure 4A,B). Relative to normal, tumours were significantly enriched for the</w:t>
+        <w:t xml:space="preserve">), so the deconvolution should be read as capturing overall immune burden rather than lymphocyte subset composition. Relative to normal, tumours were significantly enriched for the</w:t>
       </w:r>
       <w:r>
         <w:t xml:space="preserve"> </w:t>

</xml_diff>